<commit_message>
Initial commit - timetable system
</commit_message>
<xml_diff>
--- a/ALIA_timetable.docx
+++ b/ALIA_timetable.docx
@@ -587,7 +587,11 @@
             <w:tcW w:type="dxa" w:w="1530"/>
           </w:tcPr>
           <w:p>
-            <w:r/>
+            <w:r>
+              <w:t>8C</w:t>
+              <w:br/>
+              <w:t>MATHS</w:t>
+            </w:r>
           </w:p>
         </w:tc>
         <w:tc>
@@ -817,11 +821,7 @@
             <w:tcW w:type="dxa" w:w="1530"/>
           </w:tcPr>
           <w:p>
-            <w:r>
-              <w:t>8C</w:t>
-              <w:br/>
-              <w:t>MATHS</w:t>
-            </w:r>
+            <w:r/>
           </w:p>
         </w:tc>
         <w:tc>

</xml_diff>